<commit_message>
Tighten abstract validation statement
</commit_message>
<xml_diff>
--- a/drafts/gigascience_technical_note/build/vcfcache_complete_preprint.docx
+++ b/drafts/gigascience_technical_note/build/vcfcache_complete_preprint.docx
@@ -304,19 +304,13 @@
         <w:t xml:space="preserve"> </w:t>
       </w:r>
       <w:r>
-        <w:t xml:space="preserve">All 176 eligible comparisons in the final clinical campaign were semantically</w:t>
-      </w:r>
-      <w:r>
-        <w:t xml:space="preserve"> </w:t>
-      </w:r>
-      <w:r>
-        <w:t xml:space="preserve">concordant. Four SnpEff cells were excluded before inference because direct</w:t>
-      </w:r>
-      <w:r>
-        <w:t xml:space="preserve"> </w:t>
-      </w:r>
-      <w:r>
-        <w:t xml:space="preserve">SnpEff itself exhibited a processing-order-dependent warning.</w:t>
+        <w:t xml:space="preserve">All 176 evaluable direct/cached comparisons in the final clinical campaign</w:t>
+      </w:r>
+      <w:r>
+        <w:t xml:space="preserve"> </w:t>
+      </w:r>
+      <w:r>
+        <w:t xml:space="preserve">were semantically concordant, with no cache-attributable annotation mismatch.</w:t>
       </w:r>
     </w:p>
     <w:p>

</xml_diff>

<commit_message>
Clarify annotation reuse and cite Echtvar as related work
</commit_message>
<xml_diff>
--- a/drafts/gigascience_technical_note/build/vcfcache_complete_preprint.docx
+++ b/drafts/gigascience_technical_note/build/vcfcache_complete_preprint.docx
@@ -383,13 +383,13 @@
         <w:t xml:space="preserve">Findings</w:t>
       </w:r>
     </w:p>
-    <w:bookmarkStart w:id="25" w:name="Xe533f09d581a44ece50fcb9b48e9a847afe6b1e"/>
+    <w:bookmarkStart w:id="25" w:name="X441cd102a46ca53eeef88b27913589b095f0ed7"/>
     <w:p>
       <w:pPr>
         <w:pStyle w:val="Heading2"/>
       </w:pPr>
       <w:r>
-        <w:t xml:space="preserve">VCFcache reuses complete annotation recipes</w:t>
+        <w:t xml:space="preserve">VCFcache reuses complete, recipe-specific annotations</w:t>
       </w:r>
     </w:p>
     <w:p>
@@ -397,19 +397,25 @@
         <w:pStyle w:val="FirstParagraph"/>
       </w:pPr>
       <w:r>
-        <w:t xml:space="preserve">Variant annotation repeatedly evaluates alleles shared among samples. Local</w:t>
-      </w:r>
-      <w:r>
-        <w:t xml:space="preserve"> </w:t>
-      </w:r>
-      <w:r>
-        <w:t xml:space="preserve">VEP or SnpEff data caches avoid repeated database downloads, but each invocation</w:t>
-      </w:r>
-      <w:r>
-        <w:t xml:space="preserve"> </w:t>
-      </w:r>
-      <w:r>
-        <w:t xml:space="preserve">still computes every requested consequence</w:t>
+        <w:t xml:space="preserve">Across separately annotated samples, the same alleles recur, yet conventional</w:t>
+      </w:r>
+      <w:r>
+        <w:t xml:space="preserve"> </w:t>
+      </w:r>
+      <w:r>
+        <w:t xml:space="preserve">annotation recomputes the requested annotations on every run. VEP and SnpEff</w:t>
+      </w:r>
+      <w:r>
+        <w:t xml:space="preserve"> </w:t>
+      </w:r>
+      <w:r>
+        <w:t xml:space="preserve">use local reference data to avoid repeated remote database access, but still</w:t>
+      </w:r>
+      <w:r>
+        <w:t xml:space="preserve"> </w:t>
+      </w:r>
+      <w:r>
+        <w:t xml:space="preserve">evaluate each input allele</w:t>
       </w:r>
       <w:r>
         <w:t xml:space="preserve"> </w:t>
@@ -440,13 +446,31 @@
         <w:t xml:space="preserve">]</w:t>
       </w:r>
       <w:r>
-        <w:t xml:space="preserve">. Field-transfer tools can copy selected columns from a</w:t>
-      </w:r>
-      <w:r>
-        <w:t xml:space="preserve"> </w:t>
-      </w:r>
-      <w:r>
-        <w:t xml:space="preserve">donor VCF, but do not define how missing alleles traverse a composite pipeline</w:t>
+        <w:t xml:space="preserve">.</w:t>
+      </w:r>
+      <w:r>
+        <w:t xml:space="preserve"> </w:t>
+      </w:r>
+      <w:r>
+        <w:t xml:space="preserve">Lookup-based tools such as vcfanno and echtvar efficiently retrieve</w:t>
+      </w:r>
+      <w:r>
+        <w:t xml:space="preserve"> </w:t>
+      </w:r>
+      <w:r>
+        <w:t xml:space="preserve">pre-existing annotation fields from reference files or indexed archives, but</w:t>
+      </w:r>
+      <w:r>
+        <w:t xml:space="preserve"> </w:t>
+      </w:r>
+      <w:r>
+        <w:t xml:space="preserve">do not themselves invoke a user-defined annotation workflow for variants</w:t>
+      </w:r>
+      <w:r>
+        <w:t xml:space="preserve"> </w:t>
+      </w:r>
+      <w:r>
+        <w:t xml:space="preserve">absent from those resources</w:t>
       </w:r>
       <w:r>
         <w:t xml:space="preserve"> </w:t>
@@ -454,7 +478,7 @@
       <w:r>
         <w:t xml:space="preserve">[</w:t>
       </w:r>
-      <w:hyperlink w:anchor="ref-danecek2021bcftools">
+      <w:hyperlink w:anchor="ref-vcfanno2016">
         <w:r>
           <w:rPr>
             <w:rStyle w:val="Hyperlink"/>
@@ -465,7 +489,7 @@
       <w:r>
         <w:t xml:space="preserve">,</w:t>
       </w:r>
-      <w:hyperlink w:anchor="ref-vcfanno2016">
+      <w:hyperlink w:anchor="ref-pedersen2023echtvar">
         <w:r>
           <w:rPr>
             <w:rStyle w:val="Hyperlink"/>
@@ -477,31 +501,37 @@
         <w:t xml:space="preserve">]</w:t>
       </w:r>
       <w:r>
-        <w:t xml:space="preserve">. VCFcache instead stores the completed</w:t>
-      </w:r>
-      <w:r>
-        <w:t xml:space="preserve"> </w:t>
-      </w:r>
-      <w:r>
-        <w:t xml:space="preserve">output of a frozen recipe: annotator version, flags, plugins and supplementary</w:t>
-      </w:r>
-      <w:r>
-        <w:t xml:space="preserve"> </w:t>
-      </w:r>
-      <w:r>
-        <w:t xml:space="preserve">databases. For each new sample, cached alleles are retrieved, misses pass</w:t>
-      </w:r>
-      <w:r>
-        <w:t xml:space="preserve"> </w:t>
-      </w:r>
-      <w:r>
-        <w:t xml:space="preserve">through the same recipe, and both paths are assembled as a sorted, indexed BCF</w:t>
-      </w:r>
-      <w:r>
-        <w:t xml:space="preserve"> </w:t>
-      </w:r>
-      <w:r>
-        <w:t xml:space="preserve">(Figure 1).</w:t>
+        <w:t xml:space="preserve">.</w:t>
+      </w:r>
+      <w:r>
+        <w:t xml:space="preserve"> </w:t>
+      </w:r>
+      <w:r>
+        <w:t xml:space="preserve">VCFcache combines reuse with automatic fallback: it retrieves complete</w:t>
+      </w:r>
+      <w:r>
+        <w:t xml:space="preserve"> </w:t>
+      </w:r>
+      <w:r>
+        <w:t xml:space="preserve">per-allele output produced by a fixed annotation recipe—defined by the</w:t>
+      </w:r>
+      <w:r>
+        <w:t xml:space="preserve"> </w:t>
+      </w:r>
+      <w:r>
+        <w:t xml:space="preserve">annotator version, command-line options, plugins and supplementary</w:t>
+      </w:r>
+      <w:r>
+        <w:t xml:space="preserve"> </w:t>
+      </w:r>
+      <w:r>
+        <w:t xml:space="preserve">resources—and sends cache misses through that same recipe. Cached and newly</w:t>
+      </w:r>
+      <w:r>
+        <w:t xml:space="preserve"> </w:t>
+      </w:r>
+      <w:r>
+        <w:t xml:space="preserve">annotated records are then merged into a sorted, indexed BCF (Figure 1).</w:t>
       </w:r>
     </w:p>
     <w:p>
@@ -592,7 +622,7 @@
         <w:t xml:space="preserve"> </w:t>
       </w:r>
       <w:r>
-        <w:t xml:space="preserve">annotator, and both streams are merged and sorted into a complete output VCF.</w:t>
+        <w:t xml:space="preserve">annotator, and both streams are merged into a sorted, indexed output BCF.</w:t>
       </w:r>
       <w:r>
         <w:t xml:space="preserve"> </w:t>
@@ -2482,7 +2512,7 @@
           <w:rPr>
             <w:rStyle w:val="Hyperlink"/>
           </w:rPr>
-          <w:t xml:space="preserve">3</w:t>
+          <w:t xml:space="preserve">10</w:t>
         </w:r>
       </w:hyperlink>
       <w:r>
@@ -4444,7 +4474,7 @@
       </w:r>
     </w:p>
     <w:bookmarkEnd w:id="59"/>
-    <w:bookmarkStart w:id="79" w:name="references"/>
+    <w:bookmarkStart w:id="81" w:name="references"/>
     <w:p>
       <w:pPr>
         <w:pStyle w:val="Heading1"/>
@@ -4453,7 +4483,7 @@
         <w:t xml:space="preserve">References</w:t>
       </w:r>
     </w:p>
-    <w:bookmarkStart w:id="78" w:name="refs"/>
+    <w:bookmarkStart w:id="80" w:name="refs"/>
     <w:bookmarkStart w:id="61" w:name="ref-mclaren2016vep"/>
     <w:p>
       <w:pPr>
@@ -4528,13 +4558,13 @@
       </w:r>
     </w:p>
     <w:bookmarkEnd w:id="63"/>
-    <w:bookmarkStart w:id="65" w:name="ref-danecek2021bcftools"/>
+    <w:bookmarkStart w:id="65" w:name="ref-vcfanno2016"/>
     <w:p>
       <w:pPr>
         <w:pStyle w:val="Bibliography"/>
       </w:pPr>
       <w:r>
-        <w:t xml:space="preserve">3. Danecek, P, Bonfield, JK, Liddle, J, Marshall, J, Ohan, V, Pollard, MO, et al. Twelve years of SAMtools and BCFtools.</w:t>
+        <w:t xml:space="preserve">3. Pedersen, BS, Layer, RM, Quinlan, AR. Vcfanno: Fast, flexible annotation of genetic variants.</w:t>
       </w:r>
       <w:r>
         <w:t xml:space="preserve"> </w:t>
@@ -4544,20 +4574,20 @@
           <w:iCs/>
           <w:i/>
         </w:rPr>
-        <w:t xml:space="preserve">GigaScience</w:t>
-      </w:r>
-      <w:r>
-        <w:t xml:space="preserve"> </w:t>
-      </w:r>
-      <w:r>
-        <w:t xml:space="preserve">2021; 10. doi:</w:t>
+        <w:t xml:space="preserve">Genome Biology</w:t>
+      </w:r>
+      <w:r>
+        <w:t xml:space="preserve"> </w:t>
+      </w:r>
+      <w:r>
+        <w:t xml:space="preserve">2016; 17:118. doi:</w:t>
       </w:r>
       <w:hyperlink r:id="rId64">
         <w:r>
           <w:rPr>
             <w:rStyle w:val="Hyperlink"/>
           </w:rPr>
-          <w:t xml:space="preserve">10.1093/gigascience/giab008</w:t>
+          <w:t xml:space="preserve">10.1186/s13059-016-0973-5</w:t>
         </w:r>
       </w:hyperlink>
       <w:r>
@@ -4565,13 +4595,34 @@
       </w:r>
     </w:p>
     <w:bookmarkEnd w:id="65"/>
-    <w:bookmarkStart w:id="67" w:name="ref-vcfanno2016"/>
+    <w:bookmarkStart w:id="67" w:name="ref-pedersen2023echtvar"/>
     <w:p>
       <w:pPr>
         <w:pStyle w:val="Bibliography"/>
       </w:pPr>
       <w:r>
-        <w:t xml:space="preserve">4. Pedersen, BS, Layer, RM, Quinlan, AR. Vcfanno: Fast, flexible annotation of genetic variants.</w:t>
+        <w:t xml:space="preserve">4. Pedersen, BS, Ridder, J de.</w:t>
+      </w:r>
+      <w:r>
+        <w:t xml:space="preserve"> </w:t>
+      </w:r>
+      <w:r>
+        <w:t xml:space="preserve">Echtvar</w:t>
+      </w:r>
+      <w:r>
+        <w:t xml:space="preserve">: Compressed variant representation for rapid annotation and filtering of</w:t>
+      </w:r>
+      <w:r>
+        <w:t xml:space="preserve"> </w:t>
+      </w:r>
+      <w:r>
+        <w:t xml:space="preserve">SNPs</w:t>
+      </w:r>
+      <w:r>
+        <w:t xml:space="preserve"> </w:t>
+      </w:r>
+      <w:r>
+        <w:t xml:space="preserve">and indels.</w:t>
       </w:r>
       <w:r>
         <w:t xml:space="preserve"> </w:t>
@@ -4581,20 +4632,20 @@
           <w:iCs/>
           <w:i/>
         </w:rPr>
-        <w:t xml:space="preserve">Genome Biology</w:t>
-      </w:r>
-      <w:r>
-        <w:t xml:space="preserve"> </w:t>
-      </w:r>
-      <w:r>
-        <w:t xml:space="preserve">2016; 17:118. doi:</w:t>
+        <w:t xml:space="preserve">Nucleic Acids Research</w:t>
+      </w:r>
+      <w:r>
+        <w:t xml:space="preserve"> </w:t>
+      </w:r>
+      <w:r>
+        <w:t xml:space="preserve">2023; 51:e3. doi:</w:t>
       </w:r>
       <w:hyperlink r:id="rId66">
         <w:r>
           <w:rPr>
             <w:rStyle w:val="Hyperlink"/>
           </w:rPr>
-          <w:t xml:space="preserve">10.1186/s13059-016-0973-5</w:t>
+          <w:t xml:space="preserve">10.1093/nar/gkac931</w:t>
         </w:r>
       </w:hyperlink>
       <w:r>
@@ -4748,14 +4799,51 @@
       </w:r>
     </w:p>
     <w:bookmarkEnd w:id="77"/>
-    <w:bookmarkEnd w:id="78"/>
+    <w:bookmarkStart w:id="79" w:name="ref-danecek2021bcftools"/>
+    <w:p>
+      <w:pPr>
+        <w:pStyle w:val="Bibliography"/>
+      </w:pPr>
+      <w:r>
+        <w:t xml:space="preserve">10. Danecek, P, Bonfield, JK, Liddle, J, Marshall, J, Ohan, V, Pollard, MO, et al. Twelve years of SAMtools and BCFtools.</w:t>
+      </w:r>
+      <w:r>
+        <w:t xml:space="preserve"> </w:t>
+      </w:r>
+      <w:r>
+        <w:rPr>
+          <w:iCs/>
+          <w:i/>
+        </w:rPr>
+        <w:t xml:space="preserve">GigaScience</w:t>
+      </w:r>
+      <w:r>
+        <w:t xml:space="preserve"> </w:t>
+      </w:r>
+      <w:r>
+        <w:t xml:space="preserve">2021; 10. doi:</w:t>
+      </w:r>
+      <w:hyperlink r:id="rId78">
+        <w:r>
+          <w:rPr>
+            <w:rStyle w:val="Hyperlink"/>
+          </w:rPr>
+          <w:t xml:space="preserve">10.1093/gigascience/giab008</w:t>
+        </w:r>
+      </w:hyperlink>
+      <w:r>
+        <w:t xml:space="preserve">.</w:t>
+      </w:r>
+    </w:p>
+    <w:bookmarkEnd w:id="79"/>
+    <w:bookmarkEnd w:id="80"/>
     <w:p>
       <w:r>
         <w:br w:type="page"/>
       </w:r>
     </w:p>
-    <w:bookmarkEnd w:id="79"/>
-    <w:bookmarkStart w:id="80" w:name="supplementary-information"/>
+    <w:bookmarkEnd w:id="81"/>
+    <w:bookmarkStart w:id="82" w:name="supplementary-information"/>
     <w:p>
       <w:pPr>
         <w:pStyle w:val="Heading1"/>
@@ -4778,8 +4866,8 @@
         <w:t xml:space="preserve">VCFcache GigaScience Technical Note.</w:t>
       </w:r>
     </w:p>
-    <w:bookmarkEnd w:id="80"/>
-    <w:bookmarkStart w:id="86" w:name="supplementary-methods"/>
+    <w:bookmarkEnd w:id="82"/>
+    <w:bookmarkStart w:id="88" w:name="supplementary-methods"/>
     <w:p>
       <w:pPr>
         <w:pStyle w:val="Heading1"/>
@@ -4788,7 +4876,7 @@
         <w:t xml:space="preserve">Supplementary Methods</w:t>
       </w:r>
     </w:p>
-    <w:bookmarkStart w:id="81" w:name="Xa497f0c8802db69114c149215073e9594767df1"/>
+    <w:bookmarkStart w:id="83" w:name="Xa497f0c8802db69114c149215073e9594767df1"/>
     <w:p>
       <w:pPr>
         <w:pStyle w:val="Heading2"/>
@@ -4925,8 +5013,8 @@
         <w:t xml:space="preserve">reported because such structure is realistic in an applied cohort.</w:t>
       </w:r>
     </w:p>
-    <w:bookmarkEnd w:id="81"/>
-    <w:bookmarkStart w:id="82" w:name="matched-assay-extension"/>
+    <w:bookmarkEnd w:id="83"/>
+    <w:bookmarkStart w:id="84" w:name="matched-assay-extension"/>
     <w:p>
       <w:pPr>
         <w:pStyle w:val="Heading2"/>
@@ -5059,8 +5147,8 @@
         <w:t xml:space="preserve">annotation content.</w:t>
       </w:r>
     </w:p>
-    <w:bookmarkEnd w:id="82"/>
-    <w:bookmarkStart w:id="83" w:name="public-cache-provenance"/>
+    <w:bookmarkEnd w:id="84"/>
+    <w:bookmarkStart w:id="85" w:name="public-cache-provenance"/>
     <w:p>
       <w:pPr>
         <w:pStyle w:val="Heading2"/>
@@ -5127,8 +5215,8 @@
         <w:t xml:space="preserve">The labels therefore do not mean combined-population AF thresholds.</w:t>
       </w:r>
     </w:p>
-    <w:bookmarkEnd w:id="83"/>
-    <w:bookmarkStart w:id="84" w:name="Xd4d262bb7319dbb3505d52259c4d06ced83d96d"/>
+    <w:bookmarkEnd w:id="85"/>
+    <w:bookmarkStart w:id="86" w:name="Xd4d262bb7319dbb3505d52259c4d06ced83d96d"/>
     <w:p>
       <w:pPr>
         <w:pStyle w:val="Heading2"/>
@@ -5361,8 +5449,8 @@
         <w:t xml:space="preserve">must not be interpreted as evidence of poorer biological cache coverage.</w:t>
       </w:r>
     </w:p>
-    <w:bookmarkEnd w:id="84"/>
-    <w:bookmarkStart w:id="85" w:name="semantic-validation-details"/>
+    <w:bookmarkEnd w:id="86"/>
+    <w:bookmarkStart w:id="87" w:name="semantic-validation-details"/>
     <w:p>
       <w:pPr>
         <w:pStyle w:val="Heading2"/>
@@ -5647,9 +5735,9 @@
         <w:t xml:space="preserve">between annotators or arbitrary annotation configurations.</w:t>
       </w:r>
     </w:p>
-    <w:bookmarkEnd w:id="85"/>
-    <w:bookmarkEnd w:id="86"/>
-    <w:bookmarkStart w:id="89" w:name="supplementary-results"/>
+    <w:bookmarkEnd w:id="87"/>
+    <w:bookmarkEnd w:id="88"/>
+    <w:bookmarkStart w:id="91" w:name="supplementary-results"/>
     <w:p>
       <w:pPr>
         <w:pStyle w:val="Heading1"/>
@@ -5658,7 +5746,7 @@
         <w:t xml:space="preserve">Supplementary Results</w:t>
       </w:r>
     </w:p>
-    <w:bookmarkStart w:id="87" w:name="fastvep-engineering-pilots"/>
+    <w:bookmarkStart w:id="89" w:name="fastvep-engineering-pilots"/>
     <w:p>
       <w:pPr>
         <w:pStyle w:val="Heading2"/>
@@ -5917,8 +6005,8 @@
         <w:t xml:space="preserve">runtime around fastVEP.</w:t>
       </w:r>
     </w:p>
-    <w:bookmarkEnd w:id="87"/>
-    <w:bookmarkStart w:id="88" w:name="native-clinical-annotation-campaign"/>
+    <w:bookmarkEnd w:id="89"/>
+    <w:bookmarkStart w:id="90" w:name="native-clinical-annotation-campaign"/>
     <w:p>
       <w:pPr>
         <w:pStyle w:val="Heading2"/>
@@ -7467,9 +7555,9 @@
         <w:t xml:space="preserve">recoverable work performed for each variant increases.</w:t>
       </w:r>
     </w:p>
-    <w:bookmarkEnd w:id="88"/>
-    <w:bookmarkEnd w:id="89"/>
-    <w:bookmarkStart w:id="99" w:name="supplementary-figures"/>
+    <w:bookmarkEnd w:id="90"/>
+    <w:bookmarkEnd w:id="91"/>
+    <w:bookmarkStart w:id="101" w:name="supplementary-figures"/>
     <w:p>
       <w:pPr>
         <w:pStyle w:val="Heading1"/>
@@ -7487,18 +7575,18 @@
           <wp:inline>
             <wp:extent cx="5334000" cy="5408083"/>
             <wp:effectExtent b="0" l="0" r="0" t="0"/>
-            <wp:docPr descr="" title="" id="91" name="Picture"/>
+            <wp:docPr descr="" title="" id="93" name="Picture"/>
             <a:graphic>
               <a:graphicData uri="http://schemas.openxmlformats.org/drawingml/2006/picture">
                 <pic:pic>
                   <pic:nvPicPr>
-                    <pic:cNvPr descr="supplement/figures/supplementary_figure1_external_wgs_v2.png" id="92" name="Picture"/>
+                    <pic:cNvPr descr="supplement/figures/supplementary_figure1_external_wgs_v2.png" id="94" name="Picture"/>
                     <pic:cNvPicPr>
                       <a:picLocks noChangeArrowheads="1" noChangeAspect="1"/>
                     </pic:cNvPicPr>
                   </pic:nvPicPr>
                   <pic:blipFill>
-                    <a:blip r:embed="rId90"/>
+                    <a:blip r:embed="rId92"/>
                     <a:stretch>
                       <a:fillRect/>
                     </a:stretch>
@@ -7620,18 +7708,18 @@
           <wp:inline>
             <wp:extent cx="5334000" cy="3333750"/>
             <wp:effectExtent b="0" l="0" r="0" t="0"/>
-            <wp:docPr descr="" title="" id="94" name="Picture"/>
+            <wp:docPr descr="" title="" id="96" name="Picture"/>
             <a:graphic>
               <a:graphicData uri="http://schemas.openxmlformats.org/drawingml/2006/picture">
                 <pic:pic>
                   <pic:nvPicPr>
-                    <pic:cNvPr descr="supplement/figures/supplementary_figure2_fastvep_cpu_complexity.png" id="95" name="Picture"/>
+                    <pic:cNvPr descr="supplement/figures/supplementary_figure2_fastvep_cpu_complexity.png" id="97" name="Picture"/>
                     <pic:cNvPicPr>
                       <a:picLocks noChangeArrowheads="1" noChangeAspect="1"/>
                     </pic:cNvPicPr>
                   </pic:nvPicPr>
                   <pic:blipFill>
-                    <a:blip r:embed="rId93"/>
+                    <a:blip r:embed="rId95"/>
                     <a:stretch>
                       <a:fillRect/>
                     </a:stretch>
@@ -7777,18 +7865,18 @@
           <wp:inline>
             <wp:extent cx="5334000" cy="4445000"/>
             <wp:effectExtent b="0" l="0" r="0" t="0"/>
-            <wp:docPr descr="" title="" id="97" name="Picture"/>
+            <wp:docPr descr="" title="" id="99" name="Picture"/>
             <a:graphic>
               <a:graphicData uri="http://schemas.openxmlformats.org/drawingml/2006/picture">
                 <pic:pic>
                   <pic:nvPicPr>
-                    <pic:cNvPr descr="supplement/figures/v4/supplementary_figure3_annotation_load_fidelity_v4.png" id="98" name="Picture"/>
+                    <pic:cNvPr descr="supplement/figures/v4/supplementary_figure3_annotation_load_fidelity_v4.png" id="100" name="Picture"/>
                     <pic:cNvPicPr>
                       <a:picLocks noChangeArrowheads="1" noChangeAspect="1"/>
                     </pic:cNvPicPr>
                   </pic:nvPicPr>
                   <pic:blipFill>
-                    <a:blip r:embed="rId96"/>
+                    <a:blip r:embed="rId98"/>
                     <a:stretch>
                       <a:fillRect/>
                     </a:stretch>
@@ -7901,7 +7989,7 @@
         <w:t xml:space="preserve">sequencing.</w:t>
       </w:r>
     </w:p>
-    <w:bookmarkEnd w:id="99"/>
+    <w:bookmarkEnd w:id="101"/>
     <w:sectPr/>
   </w:body>
 </w:document>

</xml_diff>

<commit_message>
Correct manuscript profiling claims using archived WGS timings
</commit_message>
<xml_diff>
--- a/drafts/gigascience_technical_note/build/vcfcache_complete_preprint.docx
+++ b/drafts/gigascience_technical_note/build/vcfcache_complete_preprint.docx
@@ -3018,19 +3018,25 @@
         <w:t xml:space="preserve"> </w:t>
       </w:r>
       <w:r>
-        <w:t xml:space="preserve">perform reference-based left alignment. Input and cache must therefore already</w:t>
-      </w:r>
-      <w:r>
-        <w:t xml:space="preserve"> </w:t>
-      </w:r>
-      <w:r>
-        <w:t xml:space="preserve">share the intended left-aligned/minimal representation and contig naming;</w:t>
-      </w:r>
-      <w:r>
-        <w:t xml:space="preserve"> </w:t>
-      </w:r>
-      <w:r>
-        <w:t xml:space="preserve">reference-based normalization, when required, must use the same FASTA upstream.</w:t>
+        <w:t xml:space="preserve">perform reference-based left alignment. Input and cache must share allele</w:t>
+      </w:r>
+      <w:r>
+        <w:t xml:space="preserve"> </w:t>
+      </w:r>
+      <w:r>
+        <w:t xml:space="preserve">representation and contig naming for matching; reference-based left alignment</w:t>
+      </w:r>
+      <w:r>
+        <w:t xml:space="preserve"> </w:t>
+      </w:r>
+      <w:r>
+        <w:t xml:space="preserve">and minimal representation can establish consistent keys and, when applied,</w:t>
+      </w:r>
+      <w:r>
+        <w:t xml:space="preserve"> </w:t>
+      </w:r>
+      <w:r>
+        <w:t xml:space="preserve">must use the same reference sequence upstream.</w:t>
       </w:r>
       <w:r>
         <w:t xml:space="preserve"> </w:t>
@@ -3074,7 +3080,28 @@
         <w:t xml:space="preserve"> </w:t>
       </w:r>
       <w:r>
-        <w:t xml:space="preserve">must be populated for the supported variant universe. Recipe and parameter</w:t>
+        <w:t xml:space="preserve">must be populated for records intended to count as annotated hits. By default,</w:t>
+      </w:r>
+      <w:r>
+        <w:t xml:space="preserve"> </w:t>
+      </w:r>
+      <w:r>
+        <w:t xml:space="preserve">records still lacking that tag after annotation are filtered; the</w:t>
+      </w:r>
+      <w:r>
+        <w:t xml:space="preserve"> </w:t>
+      </w:r>
+      <w:r>
+        <w:rPr>
+          <w:rStyle w:val="VerbatimChar"/>
+        </w:rPr>
+        <w:t xml:space="preserve">--preserve-unannotated</w:t>
+      </w:r>
+      <w:r>
+        <w:t xml:space="preserve"> </w:t>
+      </w:r>
+      <w:r>
+        <w:t xml:space="preserve">option retains them. Recipe and parameter</w:t>
       </w:r>
       <w:r>
         <w:t xml:space="preserve"> </w:t>
@@ -5742,7 +5769,7 @@
       </w:r>
     </w:p>
     <w:bookmarkEnd w:id="84"/>
-    <w:bookmarkStart w:id="91" w:name="supplementary-methods"/>
+    <w:bookmarkStart w:id="92" w:name="supplementary-methods"/>
     <w:p>
       <w:pPr>
         <w:pStyle w:val="Heading1"/>
@@ -6325,7 +6352,7 @@
       </w:r>
     </w:p>
     <w:bookmarkEnd w:id="88"/>
-    <w:bookmarkStart w:id="89" w:name="runtime-model-and-limiting-cases"/>
+    <w:bookmarkStart w:id="90" w:name="runtime-model-and-limiting-cases"/>
     <w:p>
       <w:pPr>
         <w:pStyle w:val="Heading2"/>
@@ -6879,17 +6906,422 @@
         <w:t xml:space="preserve"> </w:t>
       </w:r>
       <w:r>
-        <w:t xml:space="preserve">every model parameter from independently timed stages. Existing perfect-hit</w:t>
-      </w:r>
-      <w:r>
-        <w:t xml:space="preserve"> </w:t>
-      </w:r>
-      <w:r>
-        <w:t xml:space="preserve">diagnostics are described under fastVEP engineering pilots.</w:t>
+        <w:t xml:space="preserve">every model parameter from independently timed stages.</w:t>
+      </w:r>
+    </w:p>
+    <w:bookmarkStart w:id="89" w:name="X6b845f5853c9354c8fb2889b7e1a13a61ca3e3b"/>
+    <w:p>
+      <w:pPr>
+        <w:pStyle w:val="Heading3"/>
+      </w:pPr>
+      <w:r>
+        <w:t xml:space="preserve">Observed stage timings from an existing real-WGS run</w:t>
+      </w:r>
+    </w:p>
+    <w:p>
+      <w:pPr>
+        <w:pStyle w:val="FirstParagraph"/>
+      </w:pPr>
+      <w:r>
+        <w:t xml:space="preserve">The archived measured VEP run for SGDP genome</w:t>
+      </w:r>
+      <w:r>
+        <w:t xml:space="preserve"> </w:t>
+      </w:r>
+      <w:r>
+        <w:rPr>
+          <w:rStyle w:val="VerbatimChar"/>
+        </w:rPr>
+        <w:t xml:space="preserve">LP6005519-DNA_B04</w:t>
+      </w:r>
+      <w:r>
+        <w:t xml:space="preserve"> </w:t>
+      </w:r>
+      <w:r>
+        <w:t xml:space="preserve">with the</w:t>
+      </w:r>
+      <w:r>
+        <w:t xml:space="preserve"> </w:t>
+      </w:r>
+      <w:r>
+        <w:t xml:space="preserve">gnomAD AF ≥1% cache contains 4,876,494 input alleles and 342,007 misses</w:t>
+      </w:r>
+      <w:r>
+        <w:t xml:space="preserve"> </w:t>
+      </w:r>
+      <w:r>
+        <w:t xml:space="preserve">(92.99% hits). Its command durations provide the following breakdown without</w:t>
+      </w:r>
+      <w:r>
+        <w:t xml:space="preserve"> </w:t>
+      </w:r>
+      <w:r>
+        <w:t xml:space="preserve">rerunning the sample.</w:t>
+      </w:r>
+    </w:p>
+    <w:tbl>
+      <w:tblPr>
+        <w:tblStyle w:val="Table"/>
+        <w:tblW w:type="auto" w:w="0"/>
+        <w:tblLook w:firstRow="1" w:lastRow="0" w:firstColumn="0" w:lastColumn="0" w:noHBand="0" w:noVBand="0" w:val="0020"/>
+      </w:tblPr>
+      <w:tblGrid>
+        <w:gridCol w:w="3960"/>
+        <w:gridCol w:w="3960"/>
+      </w:tblGrid>
+      <w:tr>
+        <w:trPr>
+          <w:tblHeader w:val="on"/>
+        </w:trPr>
+        <w:tc>
+          <w:tcPr/>
+          <w:p>
+            <w:pPr>
+              <w:pStyle w:val="Compact"/>
+            </w:pPr>
+            <w:r>
+              <w:t xml:space="preserve">Operation</w:t>
+            </w:r>
+          </w:p>
+        </w:tc>
+        <w:tc>
+          <w:tcPr/>
+          <w:p>
+            <w:pPr>
+              <w:pStyle w:val="Compact"/>
+              <w:jc w:val="right"/>
+            </w:pPr>
+            <w:r>
+              <w:t xml:space="preserve">Wall time (s)</w:t>
+            </w:r>
+          </w:p>
+        </w:tc>
+      </w:tr>
+      <w:tr>
+        <w:tc>
+          <w:tcPr/>
+          <w:p>
+            <w:pPr>
+              <w:pStyle w:val="Compact"/>
+            </w:pPr>
+            <w:r>
+              <w:t xml:space="preserve">Multiallelic splitting and input filtering</w:t>
+            </w:r>
+          </w:p>
+        </w:tc>
+        <w:tc>
+          <w:tcPr/>
+          <w:p>
+            <w:pPr>
+              <w:pStyle w:val="Compact"/>
+              <w:jc w:val="right"/>
+            </w:pPr>
+            <w:r>
+              <w:t xml:space="preserve">34.409</w:t>
+            </w:r>
+          </w:p>
+        </w:tc>
+      </w:tr>
+      <w:tr>
+        <w:tc>
+          <w:tcPr/>
+          <w:p>
+            <w:pPr>
+              <w:pStyle w:val="Compact"/>
+            </w:pPr>
+            <w:r>
+              <w:t xml:space="preserve">Cache annotation lookup</w:t>
+            </w:r>
+          </w:p>
+        </w:tc>
+        <w:tc>
+          <w:tcPr/>
+          <w:p>
+            <w:pPr>
+              <w:pStyle w:val="Compact"/>
+              <w:jc w:val="right"/>
+            </w:pPr>
+            <w:r>
+              <w:t xml:space="preserve">102.368</w:t>
+            </w:r>
+          </w:p>
+        </w:tc>
+      </w:tr>
+      <w:tr>
+        <w:tc>
+          <w:tcPr/>
+          <w:p>
+            <w:pPr>
+              <w:pStyle w:val="Compact"/>
+            </w:pPr>
+            <w:r>
+              <w:t xml:space="preserve">Miss extraction</w:t>
+            </w:r>
+          </w:p>
+        </w:tc>
+        <w:tc>
+          <w:tcPr/>
+          <w:p>
+            <w:pPr>
+              <w:pStyle w:val="Compact"/>
+              <w:jc w:val="right"/>
+            </w:pPr>
+            <w:r>
+              <w:t xml:space="preserve">44.556</w:t>
+            </w:r>
+          </w:p>
+        </w:tc>
+      </w:tr>
+      <w:tr>
+        <w:tc>
+          <w:tcPr/>
+          <w:p>
+            <w:pPr>
+              <w:pStyle w:val="Compact"/>
+            </w:pPr>
+            <w:r>
+              <w:t xml:space="preserve">VEP on misses, including input/output conversion</w:t>
+            </w:r>
+          </w:p>
+        </w:tc>
+        <w:tc>
+          <w:tcPr/>
+          <w:p>
+            <w:pPr>
+              <w:pStyle w:val="Compact"/>
+              <w:jc w:val="right"/>
+            </w:pPr>
+            <w:r>
+              <w:t xml:space="preserve">911.632</w:t>
+            </w:r>
+          </w:p>
+        </w:tc>
+      </w:tr>
+      <w:tr>
+        <w:tc>
+          <w:tcPr/>
+          <w:p>
+            <w:pPr>
+              <w:pStyle w:val="Compact"/>
+            </w:pPr>
+            <w:r>
+              <w:t xml:space="preserve">Merge annotations</w:t>
+            </w:r>
+          </w:p>
+        </w:tc>
+        <w:tc>
+          <w:tcPr/>
+          <w:p>
+            <w:pPr>
+              <w:pStyle w:val="Compact"/>
+              <w:jc w:val="right"/>
+            </w:pPr>
+            <w:r>
+              <w:t xml:space="preserve">52.822</w:t>
+            </w:r>
+          </w:p>
+        </w:tc>
+      </w:tr>
+      <w:tr>
+        <w:tc>
+          <w:tcPr/>
+          <w:p>
+            <w:pPr>
+              <w:pStyle w:val="Compact"/>
+            </w:pPr>
+            <w:r>
+              <w:t xml:space="preserve">Final filtering and output</w:t>
+            </w:r>
+          </w:p>
+        </w:tc>
+        <w:tc>
+          <w:tcPr/>
+          <w:p>
+            <w:pPr>
+              <w:pStyle w:val="Compact"/>
+              <w:jc w:val="right"/>
+            </w:pPr>
+            <w:r>
+              <w:t xml:space="preserve">59.591</w:t>
+            </w:r>
+          </w:p>
+        </w:tc>
+      </w:tr>
+      <w:tr>
+        <w:tc>
+          <w:tcPr/>
+          <w:p>
+            <w:pPr>
+              <w:pStyle w:val="Compact"/>
+            </w:pPr>
+            <w:r>
+              <w:t xml:space="preserve">Other end-to-end overhead (difference)</w:t>
+            </w:r>
+          </w:p>
+        </w:tc>
+        <w:tc>
+          <w:tcPr/>
+          <w:p>
+            <w:pPr>
+              <w:pStyle w:val="Compact"/>
+              <w:jc w:val="right"/>
+            </w:pPr>
+            <w:r>
+              <w:t xml:space="preserve">1.902</w:t>
+            </w:r>
+          </w:p>
+        </w:tc>
+      </w:tr>
+      <w:tr>
+        <w:tc>
+          <w:tcPr/>
+          <w:p>
+            <w:pPr>
+              <w:pStyle w:val="Compact"/>
+            </w:pPr>
+            <w:r>
+              <w:t xml:space="preserve">End-to-end cached runtime</w:t>
+            </w:r>
+          </w:p>
+        </w:tc>
+        <w:tc>
+          <w:tcPr/>
+          <w:p>
+            <w:pPr>
+              <w:pStyle w:val="Compact"/>
+              <w:jc w:val="right"/>
+            </w:pPr>
+            <w:r>
+              <w:t xml:space="preserve">1,207.280</w:t>
+            </w:r>
+          </w:p>
+        </w:tc>
+      </w:tr>
+    </w:tbl>
+    <w:p>
+      <w:pPr>
+        <w:pStyle w:val="BodyText"/>
+      </w:pPr>
+      <w:r>
+        <w:t xml:space="preserve">Each command includes its own output processing, compression and inline index</w:t>
+      </w:r>
+      <w:r>
+        <w:t xml:space="preserve"> </w:t>
+      </w:r>
+      <w:r>
+        <w:t xml:space="preserve">creation where specified. The six sequential command durations sum to</w:t>
+      </w:r>
+      <w:r>
+        <w:t xml:space="preserve"> </w:t>
+      </w:r>
+      <w:r>
+        <w:t xml:space="preserve">1,205.378 s. The residual is calculated against the recorded end-to-end time,</w:t>
+      </w:r>
+      <w:r>
+        <w:t xml:space="preserve"> </w:t>
+      </w:r>
+      <w:r>
+        <w:t xml:space="preserve">not attributed to a separately measured component. Direct annotation took</w:t>
+      </w:r>
+      <w:r>
+        <w:t xml:space="preserve"> </w:t>
+      </w:r>
+      <w:r>
+        <w:t xml:space="preserve">11,467.473 s; the retained pair passed its VEP semantic gate and achieved</w:t>
+      </w:r>
+      <w:r>
+        <w:t xml:space="preserve"> </w:t>
+      </w:r>
+      <w:r>
+        <w:t xml:space="preserve">9.499-fold speedup. Thus real-sample stage timing already exists; only</w:t>
+      </w:r>
+      <w:r>
+        <w:t xml:space="preserve"> </w:t>
+      </w:r>
+      <w:r>
+        <w:t xml:space="preserve">separation of internal costs such as compression versus lookup would require</w:t>
+      </w:r>
+      <w:r>
+        <w:t xml:space="preserve"> </w:t>
+      </w:r>
+      <w:r>
+        <w:t xml:space="preserve">additional instrumentation.</w:t>
+      </w:r>
+    </w:p>
+    <w:p>
+      <w:pPr>
+        <w:pStyle w:val="BodyText"/>
+      </w:pPr>
+      <w:r>
+        <w:t xml:space="preserve">Evidence:</w:t>
+      </w:r>
+      <w:r>
+        <w:t xml:space="preserve"> </w:t>
+      </w:r>
+      <w:r>
+        <w:rPr>
+          <w:rStyle w:val="VerbatimChar"/>
+        </w:rPr>
+        <w:t xml:space="preserve">figures/source_data/external_wgs_metrics.tsv</w:t>
+      </w:r>
+      <w:r>
+        <w:t xml:space="preserve">, VEP/sample/AF ≥1% row,</w:t>
+      </w:r>
+      <w:r>
+        <w:t xml:space="preserve"> </w:t>
+      </w:r>
+      <w:r>
+        <w:t xml:space="preserve">and the archived</w:t>
+      </w:r>
+      <w:r>
+        <w:t xml:space="preserve"> </w:t>
+      </w:r>
+      <w:r>
+        <w:rPr>
+          <w:rStyle w:val="VerbatimChar"/>
+        </w:rPr>
+        <w:t xml:space="preserve">workflow.log</w:t>
+      </w:r>
+      <w:r>
+        <w:t xml:space="preserve"> </w:t>
+      </w:r>
+      <w:r>
+        <w:t xml:space="preserve">under</w:t>
+      </w:r>
+      <w:r>
+        <w:t xml:space="preserve"> </w:t>
+      </w:r>
+      <w:r>
+        <w:rPr>
+          <w:rStyle w:val="VerbatimChar"/>
+        </w:rPr>
+        <w:t xml:space="preserve">benchmarks/results/raw/campaigns/external-vep-light-full52-bbef41d7db8e/measured/tasks/task-23/runs/gnomad_af_0.01/pilot/LP6005519-DNA_B04/bbef41d7db8e/cached_r01/stats/LP6005519-DNA_B04_vcstats/</w:t>
+      </w:r>
+      <w:r>
+        <w:t xml:space="preserve">.</w:t>
+      </w:r>
+      <w:r>
+        <w:t xml:space="preserve"> </w:t>
+      </w:r>
+      <w:r>
+        <w:t xml:space="preserve">The final native campaign’s 180 cached cells contain no zero-miss observation;</w:t>
+      </w:r>
+      <w:r>
+        <w:t xml:space="preserve"> </w:t>
+      </w:r>
+      <w:r>
+        <w:t xml:space="preserve">the perfect-hit case discussed in the model and early engineering pilot is a</w:t>
+      </w:r>
+      <w:r>
+        <w:t xml:space="preserve"> </w:t>
+      </w:r>
+      <w:r>
+        <w:t xml:space="preserve">separate controlled condition.</w:t>
       </w:r>
     </w:p>
     <w:bookmarkEnd w:id="89"/>
-    <w:bookmarkStart w:id="90" w:name="semantic-validation-details"/>
+    <w:bookmarkEnd w:id="90"/>
+    <w:bookmarkStart w:id="91" w:name="semantic-validation-details"/>
     <w:p>
       <w:pPr>
         <w:pStyle w:val="Heading2"/>
@@ -7174,9 +7606,9 @@
         <w:t xml:space="preserve">between annotators or arbitrary annotation configurations.</w:t>
       </w:r>
     </w:p>
-    <w:bookmarkEnd w:id="90"/>
     <w:bookmarkEnd w:id="91"/>
-    <w:bookmarkStart w:id="94" w:name="supplementary-results"/>
+    <w:bookmarkEnd w:id="92"/>
+    <w:bookmarkStart w:id="95" w:name="supplementary-results"/>
     <w:p>
       <w:pPr>
         <w:pStyle w:val="Heading1"/>
@@ -7185,7 +7617,7 @@
         <w:t xml:space="preserve">Supplementary Results</w:t>
       </w:r>
     </w:p>
-    <w:bookmarkStart w:id="92" w:name="fastvep-engineering-pilots"/>
+    <w:bookmarkStart w:id="93" w:name="fastvep-engineering-pilots"/>
     <w:p>
       <w:pPr>
         <w:pStyle w:val="Heading2"/>
@@ -7403,19 +7835,37 @@
         <w:t xml:space="preserve"> </w:t>
       </w:r>
       <w:r>
-        <w:t xml:space="preserve">overlap other work. At 100% hits there is no native annotation stage. A complete</w:t>
-      </w:r>
-      <w:r>
-        <w:t xml:space="preserve"> </w:t>
-      </w:r>
-      <w:r>
-        <w:t xml:space="preserve">stage decomposition at a non-perfect hit rate remains to be measured before</w:t>
-      </w:r>
-      <w:r>
-        <w:t xml:space="preserve"> </w:t>
-      </w:r>
-      <w:r>
-        <w:t xml:space="preserve">fitting all components of the runtime model independently.</w:t>
+        <w:t xml:space="preserve">overlap other work. The 100% condition was a deliberately constructed pilot</w:t>
+      </w:r>
+      <w:r>
+        <w:t xml:space="preserve"> </w:t>
+      </w:r>
+      <w:r>
+        <w:t xml:space="preserve">cache, not an observed perfect hit rate in the final biological campaign.</w:t>
+      </w:r>
+      <w:r>
+        <w:t xml:space="preserve"> </w:t>
+      </w:r>
+      <w:r>
+        <w:t xml:space="preserve">Archived runs with misses also contain stage timings, including the real-WGS</w:t>
+      </w:r>
+      <w:r>
+        <w:t xml:space="preserve"> </w:t>
+      </w:r>
+      <w:r>
+        <w:t xml:space="preserve">example in the Supplementary runtime model. That command-level breakdown</w:t>
+      </w:r>
+      <w:r>
+        <w:t xml:space="preserve"> </w:t>
+      </w:r>
+      <w:r>
+        <w:t xml:space="preserve">includes compression and indexing within each stage; it does not separately</w:t>
+      </w:r>
+      <w:r>
+        <w:t xml:space="preserve"> </w:t>
+      </w:r>
+      <w:r>
+        <w:t xml:space="preserve">identify every internal operation or fit all model parameters.</w:t>
       </w:r>
     </w:p>
     <w:p>
@@ -7500,8 +7950,8 @@
         <w:t xml:space="preserve">runtime around fastVEP.</w:t>
       </w:r>
     </w:p>
-    <w:bookmarkEnd w:id="92"/>
-    <w:bookmarkStart w:id="93" w:name="native-clinical-annotation-campaign"/>
+    <w:bookmarkEnd w:id="93"/>
+    <w:bookmarkStart w:id="94" w:name="native-clinical-annotation-campaign"/>
     <w:p>
       <w:pPr>
         <w:pStyle w:val="Heading2"/>
@@ -8986,9 +9436,9 @@
         <w:t xml:space="preserve">recoverable work performed for each variant increases.</w:t>
       </w:r>
     </w:p>
-    <w:bookmarkEnd w:id="93"/>
     <w:bookmarkEnd w:id="94"/>
-    <w:bookmarkStart w:id="104" w:name="supplementary-figures"/>
+    <w:bookmarkEnd w:id="95"/>
+    <w:bookmarkStart w:id="105" w:name="supplementary-figures"/>
     <w:p>
       <w:pPr>
         <w:pStyle w:val="Heading1"/>
@@ -9006,18 +9456,18 @@
           <wp:inline>
             <wp:extent cx="5334000" cy="5408083"/>
             <wp:effectExtent b="0" l="0" r="0" t="0"/>
-            <wp:docPr descr="" title="" id="96" name="Picture"/>
+            <wp:docPr descr="" title="" id="97" name="Picture"/>
             <a:graphic>
               <a:graphicData uri="http://schemas.openxmlformats.org/drawingml/2006/picture">
                 <pic:pic>
                   <pic:nvPicPr>
-                    <pic:cNvPr descr="supplement/figures/supplementary_figure1_external_wgs_v2.png" id="97" name="Picture"/>
+                    <pic:cNvPr descr="supplement/figures/supplementary_figure1_external_wgs_v2.png" id="98" name="Picture"/>
                     <pic:cNvPicPr>
                       <a:picLocks noChangeArrowheads="1" noChangeAspect="1"/>
                     </pic:cNvPicPr>
                   </pic:nvPicPr>
                   <pic:blipFill>
-                    <a:blip r:embed="rId95"/>
+                    <a:blip r:embed="rId96"/>
                     <a:stretch>
                       <a:fillRect/>
                     </a:stretch>
@@ -9139,18 +9589,18 @@
           <wp:inline>
             <wp:extent cx="5334000" cy="3333750"/>
             <wp:effectExtent b="0" l="0" r="0" t="0"/>
-            <wp:docPr descr="" title="" id="99" name="Picture"/>
+            <wp:docPr descr="" title="" id="100" name="Picture"/>
             <a:graphic>
               <a:graphicData uri="http://schemas.openxmlformats.org/drawingml/2006/picture">
                 <pic:pic>
                   <pic:nvPicPr>
-                    <pic:cNvPr descr="supplement/figures/supplementary_figure2_fastvep_cpu_complexity.png" id="100" name="Picture"/>
+                    <pic:cNvPr descr="supplement/figures/supplementary_figure2_fastvep_cpu_complexity.png" id="101" name="Picture"/>
                     <pic:cNvPicPr>
                       <a:picLocks noChangeArrowheads="1" noChangeAspect="1"/>
                     </pic:cNvPicPr>
                   </pic:nvPicPr>
                   <pic:blipFill>
-                    <a:blip r:embed="rId98"/>
+                    <a:blip r:embed="rId99"/>
                     <a:stretch>
                       <a:fillRect/>
                     </a:stretch>
@@ -9296,18 +9746,18 @@
           <wp:inline>
             <wp:extent cx="5334000" cy="4445000"/>
             <wp:effectExtent b="0" l="0" r="0" t="0"/>
-            <wp:docPr descr="" title="" id="102" name="Picture"/>
+            <wp:docPr descr="" title="" id="103" name="Picture"/>
             <a:graphic>
               <a:graphicData uri="http://schemas.openxmlformats.org/drawingml/2006/picture">
                 <pic:pic>
                   <pic:nvPicPr>
-                    <pic:cNvPr descr="supplement/figures/v4/supplementary_figure3_annotation_load_fidelity_v4.png" id="103" name="Picture"/>
+                    <pic:cNvPr descr="supplement/figures/v4/supplementary_figure3_annotation_load_fidelity_v4.png" id="104" name="Picture"/>
                     <pic:cNvPicPr>
                       <a:picLocks noChangeArrowheads="1" noChangeAspect="1"/>
                     </pic:cNvPicPr>
                   </pic:nvPicPr>
                   <pic:blipFill>
-                    <a:blip r:embed="rId101"/>
+                    <a:blip r:embed="rId102"/>
                     <a:stretch>
                       <a:fillRect/>
                     </a:stretch>
@@ -9420,7 +9870,7 @@
         <w:t xml:space="preserve">sequencing.</w:t>
       </w:r>
     </w:p>
-    <w:bookmarkEnd w:id="104"/>
+    <w:bookmarkEnd w:id="105"/>
     <w:sectPr>
       <w:footnotePr>
         <w:numRestart w:val="eachSect"/>

</xml_diff>